<commit_message>
Fix a verbatim-transcription gap; flag a real CDS Portal URL inconsistency
Re-opened all four poster photographs directly rather than relying on the
existing transcription. Found that the CDS Food Card User Guide poster
names the CDS Portal as dining.iiit.ac.in at its top and mess.iiit.ac.in
at its own bottom contact line -- a real inconsistency on CDS's own
signage, not present on the main CDS overview poster (consistent
throughout). The original transcription had glossed the bottom line as
"portal above" instead of reading it verbatim, which is why this was
missed the first time.

Narrow, scoped changes only: corrected the braindump's transcription to
be verbatim and flagged the discrepancy; added one clause to the System
Map's Resources bullet and one new Outstanding Data Collection item.
Nothing else in either document was touched.
</commit_message>
<xml_diff>
--- a/deliverables/phase-2/System Map.docx
+++ b/deliverables/phase-2/System Map.docx
@@ -467,7 +467,7 @@
         <w:t xml:space="preserve"> </w:t>
       </w:r>
       <w:r>
-        <w:t xml:space="preserve">the registration and billing platform (CDS Portal,</w:t>
+        <w:t xml:space="preserve">the registration and billing platform (CDS Portal — named as</w:t>
       </w:r>
       <w:r>
         <w:t xml:space="preserve"> </w:t>
@@ -479,7 +479,25 @@
         <w:t xml:space="preserve">dining.iiit.ac.in</w:t>
       </w:r>
       <w:r>
-        <w:t xml:space="preserve">, IIIT network/VPN only); the personal QR access credential (regenerable if compromised — the old code/Food Card is invalidated the moment a new one is issued); the Food Card system for non-student diners (cashless, QR-billed, issued at CFS in the Himalaya Administrative Block basement for a ₹100 fee, meals registered one day ahead for the discounted rate); four physically distinct dining halls and kitchens (table below); the four-day procurement lead time itself, a resource constraint shared equally by every actor rather than an asset any one of them controls; a fully-equipped on-site kitchen at Kadamba (roti line, a multi-item cooker that keeps veg/non-veg physically separated, a tilting curry/steaming machine, a knife sterilizer, vegetable/rice/lentil prep automation, cold and dry storage run by</w:t>
+        <w:t xml:space="preserve"> </w:t>
+      </w:r>
+      <w:r>
+        <w:t xml:space="preserve">on three of the four posters, but as</w:t>
+      </w:r>
+      <w:r>
+        <w:t xml:space="preserve"> </w:t>
+      </w:r>
+      <w:r>
+        <w:rPr>
+          <w:rStyle w:val="VerbatimChar"/>
+        </w:rPr>
+        <w:t xml:space="preserve">mess.iiit.ac.in</w:t>
+      </w:r>
+      <w:r>
+        <w:t xml:space="preserve"> </w:t>
+      </w:r>
+      <w:r>
+        <w:t xml:space="preserve">at the bottom of the Food Card User Guide poster specifically, a direct, physically-displayed inconsistency on CDS’s own signage at Kadamba, not a project data-entry error — see Outstanding Data Collection; IIIT network/VPN only); the personal QR access credential (regenerable if compromised — the old code/Food Card is invalidated the moment a new one is issued); the Food Card system for non-student diners (cashless, QR-billed, issued at CFS in the Himalaya Administrative Block basement for a ₹100 fee, meals registered one day ahead for the discounted rate); four physically distinct dining halls and kitchens (table below); the four-day procurement lead time itself, a resource constraint shared equally by every actor rather than an asset any one of them controls; a fully-equipped on-site kitchen at Kadamba (roti line, a multi-item cooker that keeps veg/non-veg physically separated, a tilting curry/steaming machine, a knife sterilizer, vegetable/rice/lentil prep automation, cold and dry storage run by</w:t>
       </w:r>
       <w:r>
         <w:t xml:space="preserve"> </w:t>
@@ -3458,6 +3476,48 @@
         </w:numPr>
       </w:pPr>
       <w:r>
+        <w:t xml:space="preserve">Which CDS Portal domain is actually live: the Food Card User Guide poster names</w:t>
+      </w:r>
+      <w:r>
+        <w:t xml:space="preserve"> </w:t>
+      </w:r>
+      <w:r>
+        <w:rPr>
+          <w:rStyle w:val="VerbatimChar"/>
+        </w:rPr>
+        <w:t xml:space="preserve">dining.iiit.ac.in</w:t>
+      </w:r>
+      <w:r>
+        <w:t xml:space="preserve"> </w:t>
+      </w:r>
+      <w:r>
+        <w:t xml:space="preserve">at its top and</w:t>
+      </w:r>
+      <w:r>
+        <w:t xml:space="preserve"> </w:t>
+      </w:r>
+      <w:r>
+        <w:rPr>
+          <w:rStyle w:val="VerbatimChar"/>
+        </w:rPr>
+        <w:t xml:space="preserve">mess.iiit.ac.in</w:t>
+      </w:r>
+      <w:r>
+        <w:t xml:space="preserve"> </w:t>
+      </w:r>
+      <w:r>
+        <w:t xml:space="preserve">at its bottom contact line — a direct, verified inconsistency on the poster itself (confirmed by re-reading the source photograph directly, 2026-09-13), not present on the main CDS overview poster, which is consistent throughout. A one-line question to CDS/CFS settles this.</w:t>
+      </w:r>
+    </w:p>
+    <w:p>
+      <w:pPr>
+        <w:pStyle w:val="Compact"/>
+        <w:numPr>
+          <w:ilvl w:val="0"/>
+          <w:numId w:val="1004"/>
+        </w:numPr>
+      </w:pPr>
+      <w:r>
         <w:t xml:space="preserve">A single added interview question for R3: what happens to a student’s attendance decision once they know the coming week’s menu — does knowing change whether they register or show up? Answerable with the existing six respondents; no new interview round needed.</w:t>
       </w:r>
     </w:p>

</xml_diff>

<commit_message>
Restore removed System Map diagrams, add per-chain diagrams to Task 7
The self-containment pass removed seven loop diagrams from the System
Map that were never asked to go, confusing "no prose references to
files outside the PDF" with "no images." Restores all seven, each with
a short plain-prose caption instead of the old labeled-VARIABLES
format.

Task 7 never had a diagram for more than one of its six Iceberg
chains, even before the self-containment rewrite. Adds six new compact
diagrams, one per chain, each a condensed event/pattern/structure/
mental-model visual sitting above that chain's full bulleted detail in
the text.

Both PDFs rebuilt and re-verified page by page.
</commit_message>
<xml_diff>
--- a/deliverables/phase-2/System Map.docx
+++ b/deliverables/phase-2/System Map.docx
@@ -1466,7 +1466,7 @@
       </w:r>
     </w:p>
     <w:bookmarkEnd w:id="32"/>
-    <w:bookmarkStart w:id="33" w:name="Xcd7fe0675233f8ccd4e4bf391c53413e99e33f7"/>
+    <w:bookmarkStart w:id="54" w:name="Xcd7fe0675233f8ccd4e4bf391c53413e99e33f7"/>
     <w:p>
       <w:pPr>
         <w:pStyle w:val="Heading1"/>
@@ -1496,11 +1496,460 @@
         <w:pStyle w:val="BodyText"/>
       </w:pPr>
       <w:r>
-        <w:t xml:space="preserve">Fourteen different feedback mechanisms were checked across this project for whether they actually close into loops, not just whether they sound like one. Five genuinely do: the resale market feeding back into looser registration, the menu rotation process (the cleanest one, every link confirmed directly), the shortage and holiday exception described above, Kadamba’s popularity feeding its own scarcity, and waste disposal quietly removing pressure to fix anything upstream. Several others look like loops but aren’t once actually tested: Skip Meal works but nothing feeds back from it, a proposed link between menu predictability and selective skipping never closes on its own, an idea that falling attendance would pressure the vendor on quality turns out to be flatly untrue since vendor payment doesn’t depend on attendance at all, and an earlier idea that scarcity at Kadamba would push people toward other messes turns out to be the opposite of what actually happens, people lock down Kadamba harder when it’s scarce, not less.</w:t>
-      </w:r>
-    </w:p>
-    <w:bookmarkEnd w:id="33"/>
-    <w:bookmarkStart w:id="34" w:name="culture-health-and-what-isnt-a-problem"/>
+        <w:t xml:space="preserve">Fourteen different feedback mechanisms were checked across this project for whether they actually close into loops, not just whether they sound like one.</w:t>
+      </w:r>
+    </w:p>
+    <w:p>
+      <w:pPr>
+        <w:pStyle w:val="BodyText"/>
+      </w:pPr>
+      <w:r>
+        <w:t xml:space="preserve">Registering broadly feeds the resale market, and the resale market probably makes registering broadly feel safer, since there’s a way to recover value from a slot you don’t use.</w:t>
+      </w:r>
+    </w:p>
+    <w:p>
+      <w:pPr>
+        <w:pStyle w:val="CaptionedFigure"/>
+      </w:pPr>
+      <w:r>
+        <w:drawing>
+          <wp:inline>
+            <wp:extent cx="5334000" cy="4308230"/>
+            <wp:effectExtent b="0" l="0" r="0" t="0"/>
+            <wp:docPr descr="Registration and Resale Loop" title="" id="34" name="Picture"/>
+            <a:graphic>
+              <a:graphicData uri="http://schemas.openxmlformats.org/drawingml/2006/picture">
+                <pic:pic>
+                  <pic:nvPicPr>
+                    <pic:cNvPr descr="assets/diagram4-cld-r1-resale.png" id="35" name="Picture"/>
+                    <pic:cNvPicPr>
+                      <a:picLocks noChangeArrowheads="1" noChangeAspect="1"/>
+                    </pic:cNvPicPr>
+                  </pic:nvPicPr>
+                  <pic:blipFill>
+                    <a:blip r:embed="rId33"/>
+                    <a:stretch>
+                      <a:fillRect/>
+                    </a:stretch>
+                  </pic:blipFill>
+                  <pic:spPr bwMode="auto">
+                    <a:xfrm>
+                      <a:off x="0" y="0"/>
+                      <a:ext cx="5334000" cy="4308230"/>
+                    </a:xfrm>
+                    <a:prstGeom prst="rect">
+                      <a:avLst/>
+                    </a:prstGeom>
+                    <a:noFill/>
+                    <a:ln w="9525">
+                      <a:noFill/>
+                      <a:headEnd/>
+                      <a:tailEnd/>
+                    </a:ln>
+                  </pic:spPr>
+                </pic:pic>
+              </a:graphicData>
+            </a:graphic>
+          </wp:inline>
+        </w:drawing>
+      </w:r>
+    </w:p>
+    <w:p>
+      <w:pPr>
+        <w:pStyle w:val="ImageCaption"/>
+      </w:pPr>
+      <w:r>
+        <w:t xml:space="preserve">Registration and Resale Loop</w:t>
+      </w:r>
+    </w:p>
+    <w:p>
+      <w:pPr>
+        <w:pStyle w:val="BodyText"/>
+      </w:pPr>
+      <w:r>
+        <w:t xml:space="preserve">Skip Meal was designed to stop the kitchen over preparing for a known no show. It’s real and it functions, but almost nobody uses it, since it gives the student nothing back.</w:t>
+      </w:r>
+    </w:p>
+    <w:p>
+      <w:pPr>
+        <w:pStyle w:val="CaptionedFigure"/>
+      </w:pPr>
+      <w:r>
+        <w:drawing>
+          <wp:inline>
+            <wp:extent cx="5334000" cy="4406347"/>
+            <wp:effectExtent b="0" l="0" r="0" t="0"/>
+            <wp:docPr descr="Skip Meal Loop" title="" id="37" name="Picture"/>
+            <a:graphic>
+              <a:graphicData uri="http://schemas.openxmlformats.org/drawingml/2006/picture">
+                <pic:pic>
+                  <pic:nvPicPr>
+                    <pic:cNvPr descr="assets/diagram5-cld-b1-skipmeal.png" id="38" name="Picture"/>
+                    <pic:cNvPicPr>
+                      <a:picLocks noChangeArrowheads="1" noChangeAspect="1"/>
+                    </pic:cNvPicPr>
+                  </pic:nvPicPr>
+                  <pic:blipFill>
+                    <a:blip r:embed="rId36"/>
+                    <a:stretch>
+                      <a:fillRect/>
+                    </a:stretch>
+                  </pic:blipFill>
+                  <pic:spPr bwMode="auto">
+                    <a:xfrm>
+                      <a:off x="0" y="0"/>
+                      <a:ext cx="5334000" cy="4406347"/>
+                    </a:xfrm>
+                    <a:prstGeom prst="rect">
+                      <a:avLst/>
+                    </a:prstGeom>
+                    <a:noFill/>
+                    <a:ln w="9525">
+                      <a:noFill/>
+                      <a:headEnd/>
+                      <a:tailEnd/>
+                    </a:ln>
+                  </pic:spPr>
+                </pic:pic>
+              </a:graphicData>
+            </a:graphic>
+          </wp:inline>
+        </w:drawing>
+      </w:r>
+    </w:p>
+    <w:p>
+      <w:pPr>
+        <w:pStyle w:val="ImageCaption"/>
+      </w:pPr>
+      <w:r>
+        <w:t xml:space="preserve">Skip Meal Loop</w:t>
+      </w:r>
+    </w:p>
+    <w:p>
+      <w:pPr>
+        <w:pStyle w:val="BodyText"/>
+      </w:pPr>
+      <w:r>
+        <w:t xml:space="preserve">The idea that scarcity at Kadamba would push people toward Bakul or Palash instead turns out to be the opposite of what actually happens. People lock down Kadamba harder when it’s scarce, not less.</w:t>
+      </w:r>
+    </w:p>
+    <w:p>
+      <w:pPr>
+        <w:pStyle w:val="CaptionedFigure"/>
+      </w:pPr>
+      <w:r>
+        <w:drawing>
+          <wp:inline>
+            <wp:extent cx="5334000" cy="4638260"/>
+            <wp:effectExtent b="0" l="0" r="0" t="0"/>
+            <wp:docPr descr="Capacity Redistribution Loop" title="" id="40" name="Picture"/>
+            <a:graphic>
+              <a:graphicData uri="http://schemas.openxmlformats.org/drawingml/2006/picture">
+                <pic:pic>
+                  <pic:nvPicPr>
+                    <pic:cNvPr descr="assets/diagram6-cld-b2-redistribution.png" id="41" name="Picture"/>
+                    <pic:cNvPicPr>
+                      <a:picLocks noChangeArrowheads="1" noChangeAspect="1"/>
+                    </pic:cNvPicPr>
+                  </pic:nvPicPr>
+                  <pic:blipFill>
+                    <a:blip r:embed="rId39"/>
+                    <a:stretch>
+                      <a:fillRect/>
+                    </a:stretch>
+                  </pic:blipFill>
+                  <pic:spPr bwMode="auto">
+                    <a:xfrm>
+                      <a:off x="0" y="0"/>
+                      <a:ext cx="5334000" cy="4638260"/>
+                    </a:xfrm>
+                    <a:prstGeom prst="rect">
+                      <a:avLst/>
+                    </a:prstGeom>
+                    <a:noFill/>
+                    <a:ln w="9525">
+                      <a:noFill/>
+                      <a:headEnd/>
+                      <a:tailEnd/>
+                    </a:ln>
+                  </pic:spPr>
+                </pic:pic>
+              </a:graphicData>
+            </a:graphic>
+          </wp:inline>
+        </w:drawing>
+      </w:r>
+    </w:p>
+    <w:p>
+      <w:pPr>
+        <w:pStyle w:val="ImageCaption"/>
+      </w:pPr>
+      <w:r>
+        <w:t xml:space="preserve">Capacity Redistribution Loop</w:t>
+      </w:r>
+    </w:p>
+    <w:p>
+      <w:pPr>
+        <w:pStyle w:val="BodyText"/>
+      </w:pPr>
+      <w:r>
+        <w:t xml:space="preserve">A late night, low sleep pattern driving next day skipping is well supported by what students actually said. Whether that skip then causes a later energy crash and a second round of late night behavior is not something anyone’s actually checked yet.</w:t>
+      </w:r>
+    </w:p>
+    <w:p>
+      <w:pPr>
+        <w:pStyle w:val="CaptionedFigure"/>
+      </w:pPr>
+      <w:r>
+        <w:drawing>
+          <wp:inline>
+            <wp:extent cx="5334000" cy="4381500"/>
+            <wp:effectExtent b="0" l="0" r="0" t="0"/>
+            <wp:docPr descr="Late Night and Energy Crash Loop, Candidate" title="" id="43" name="Picture"/>
+            <a:graphic>
+              <a:graphicData uri="http://schemas.openxmlformats.org/drawingml/2006/picture">
+                <pic:pic>
+                  <pic:nvPicPr>
+                    <pic:cNvPr descr="assets/diagram7-cld-candidate-skip-crash.png" id="44" name="Picture"/>
+                    <pic:cNvPicPr>
+                      <a:picLocks noChangeArrowheads="1" noChangeAspect="1"/>
+                    </pic:cNvPicPr>
+                  </pic:nvPicPr>
+                  <pic:blipFill>
+                    <a:blip r:embed="rId42"/>
+                    <a:stretch>
+                      <a:fillRect/>
+                    </a:stretch>
+                  </pic:blipFill>
+                  <pic:spPr bwMode="auto">
+                    <a:xfrm>
+                      <a:off x="0" y="0"/>
+                      <a:ext cx="5334000" cy="4381500"/>
+                    </a:xfrm>
+                    <a:prstGeom prst="rect">
+                      <a:avLst/>
+                    </a:prstGeom>
+                    <a:noFill/>
+                    <a:ln w="9525">
+                      <a:noFill/>
+                      <a:headEnd/>
+                      <a:tailEnd/>
+                    </a:ln>
+                  </pic:spPr>
+                </pic:pic>
+              </a:graphicData>
+            </a:graphic>
+          </wp:inline>
+        </w:drawing>
+      </w:r>
+    </w:p>
+    <w:p>
+      <w:pPr>
+        <w:pStyle w:val="ImageCaption"/>
+      </w:pPr>
+      <w:r>
+        <w:t xml:space="preserve">Late Night and Energy Crash Loop, Candidate</w:t>
+      </w:r>
+    </w:p>
+    <w:p>
+      <w:pPr>
+        <w:pStyle w:val="BodyText"/>
+      </w:pPr>
+      <w:r>
+        <w:t xml:space="preserve">The menu rotation process is the cleanest loop found anywhere in this project. Every link in it, from complaint to committee to an actual rotation, is confirmed directly by the person who ran it.</w:t>
+      </w:r>
+    </w:p>
+    <w:p>
+      <w:pPr>
+        <w:pStyle w:val="CaptionedFigure"/>
+      </w:pPr>
+      <w:r>
+        <w:drawing>
+          <wp:inline>
+            <wp:extent cx="5334000" cy="4308230"/>
+            <wp:effectExtent b="0" l="0" r="0" t="0"/>
+            <wp:docPr descr="Menu Rotation Governance Loop" title="" id="46" name="Picture"/>
+            <a:graphic>
+              <a:graphicData uri="http://schemas.openxmlformats.org/drawingml/2006/picture">
+                <pic:pic>
+                  <pic:nvPicPr>
+                    <pic:cNvPr descr="assets/diagram10-cld-b3-menu-rotation.png" id="47" name="Picture"/>
+                    <pic:cNvPicPr>
+                      <a:picLocks noChangeArrowheads="1" noChangeAspect="1"/>
+                    </pic:cNvPicPr>
+                  </pic:nvPicPr>
+                  <pic:blipFill>
+                    <a:blip r:embed="rId45"/>
+                    <a:stretch>
+                      <a:fillRect/>
+                    </a:stretch>
+                  </pic:blipFill>
+                  <pic:spPr bwMode="auto">
+                    <a:xfrm>
+                      <a:off x="0" y="0"/>
+                      <a:ext cx="5334000" cy="4308230"/>
+                    </a:xfrm>
+                    <a:prstGeom prst="rect">
+                      <a:avLst/>
+                    </a:prstGeom>
+                    <a:noFill/>
+                    <a:ln w="9525">
+                      <a:noFill/>
+                      <a:headEnd/>
+                      <a:tailEnd/>
+                    </a:ln>
+                  </pic:spPr>
+                </pic:pic>
+              </a:graphicData>
+            </a:graphic>
+          </wp:inline>
+        </w:drawing>
+      </w:r>
+    </w:p>
+    <w:p>
+      <w:pPr>
+        <w:pStyle w:val="ImageCaption"/>
+      </w:pPr>
+      <w:r>
+        <w:t xml:space="preserve">Menu Rotation Governance Loop</w:t>
+      </w:r>
+    </w:p>
+    <w:p>
+      <w:pPr>
+        <w:pStyle w:val="BodyText"/>
+      </w:pPr>
+      <w:r>
+        <w:t xml:space="preserve">The same fix created a side effect its own architect flagged unprompted: once the menu is known ahead of time, some students may plan around it and skip on days they already know they’ll dislike.</w:t>
+      </w:r>
+    </w:p>
+    <w:p>
+      <w:pPr>
+        <w:pStyle w:val="CaptionedFigure"/>
+      </w:pPr>
+      <w:r>
+        <w:drawing>
+          <wp:inline>
+            <wp:extent cx="5334000" cy="4406347"/>
+            <wp:effectExtent b="0" l="0" r="0" t="0"/>
+            <wp:docPr descr="Menu Transparency Loop, Candidate" title="" id="49" name="Picture"/>
+            <a:graphic>
+              <a:graphicData uri="http://schemas.openxmlformats.org/drawingml/2006/picture">
+                <pic:pic>
+                  <pic:nvPicPr>
+                    <pic:cNvPr descr="assets/diagram11-cld-r3-menu-backfire.png" id="50" name="Picture"/>
+                    <pic:cNvPicPr>
+                      <a:picLocks noChangeArrowheads="1" noChangeAspect="1"/>
+                    </pic:cNvPicPr>
+                  </pic:nvPicPr>
+                  <pic:blipFill>
+                    <a:blip r:embed="rId48"/>
+                    <a:stretch>
+                      <a:fillRect/>
+                    </a:stretch>
+                  </pic:blipFill>
+                  <pic:spPr bwMode="auto">
+                    <a:xfrm>
+                      <a:off x="0" y="0"/>
+                      <a:ext cx="5334000" cy="4406347"/>
+                    </a:xfrm>
+                    <a:prstGeom prst="rect">
+                      <a:avLst/>
+                    </a:prstGeom>
+                    <a:noFill/>
+                    <a:ln w="9525">
+                      <a:noFill/>
+                      <a:headEnd/>
+                      <a:tailEnd/>
+                    </a:ln>
+                  </pic:spPr>
+                </pic:pic>
+              </a:graphicData>
+            </a:graphic>
+          </wp:inline>
+        </w:drawing>
+      </w:r>
+    </w:p>
+    <w:p>
+      <w:pPr>
+        <w:pStyle w:val="ImageCaption"/>
+      </w:pPr>
+      <w:r>
+        <w:t xml:space="preserve">Menu Transparency Loop, Candidate</w:t>
+      </w:r>
+    </w:p>
+    <w:p>
+      <w:pPr>
+        <w:pStyle w:val="BodyText"/>
+      </w:pPr>
+      <w:r>
+        <w:t xml:space="preserve">And the clearest proof the whole system can actually work differently: the shortage and holiday exception described earlier, where registration eased up, billing followed real attendance, and the vendor absorbed some uncertainty in exchange for it, before everything reverted once the trigger passed.</w:t>
+      </w:r>
+    </w:p>
+    <w:p>
+      <w:pPr>
+        <w:pStyle w:val="CaptionedFigure"/>
+      </w:pPr>
+      <w:r>
+        <w:drawing>
+          <wp:inline>
+            <wp:extent cx="5334000" cy="4308230"/>
+            <wp:effectExtent b="0" l="0" r="0" t="0"/>
+            <wp:docPr descr="Shock-Adaptive Registration Relaxation Loop" title="" id="52" name="Picture"/>
+            <a:graphic>
+              <a:graphicData uri="http://schemas.openxmlformats.org/drawingml/2006/picture">
+                <pic:pic>
+                  <pic:nvPicPr>
+                    <pic:cNvPr descr="assets/diagram14-cld-b4-shock-adaptive.png" id="53" name="Picture"/>
+                    <pic:cNvPicPr>
+                      <a:picLocks noChangeArrowheads="1" noChangeAspect="1"/>
+                    </pic:cNvPicPr>
+                  </pic:nvPicPr>
+                  <pic:blipFill>
+                    <a:blip r:embed="rId51"/>
+                    <a:stretch>
+                      <a:fillRect/>
+                    </a:stretch>
+                  </pic:blipFill>
+                  <pic:spPr bwMode="auto">
+                    <a:xfrm>
+                      <a:off x="0" y="0"/>
+                      <a:ext cx="5334000" cy="4308230"/>
+                    </a:xfrm>
+                    <a:prstGeom prst="rect">
+                      <a:avLst/>
+                    </a:prstGeom>
+                    <a:noFill/>
+                    <a:ln w="9525">
+                      <a:noFill/>
+                      <a:headEnd/>
+                      <a:tailEnd/>
+                    </a:ln>
+                  </pic:spPr>
+                </pic:pic>
+              </a:graphicData>
+            </a:graphic>
+          </wp:inline>
+        </w:drawing>
+      </w:r>
+    </w:p>
+    <w:p>
+      <w:pPr>
+        <w:pStyle w:val="ImageCaption"/>
+      </w:pPr>
+      <w:r>
+        <w:t xml:space="preserve">Shock-Adaptive Registration Relaxation Loop</w:t>
+      </w:r>
+    </w:p>
+    <w:p>
+      <w:pPr>
+        <w:pStyle w:val="BodyText"/>
+      </w:pPr>
+      <w:r>
+        <w:t xml:space="preserve">Several other candidates were checked and don’t hold up as loops once actually tested. The idea that falling attendance would pressure the vendor on quality turns out to be flatly untrue, since vendor payment doesn’t depend on attendance at all. Waste disposal quietly removes any pressure to fix what’s upstream of it, closing back into more waste next cycle, though how strong that particular link really is stays an assumption. And a known but ignored gap in who owns this problem looks less like a spiral getting worse over time and more like a stable, stuck situation.</w:t>
+      </w:r>
+    </w:p>
+    <w:bookmarkEnd w:id="54"/>
+    <w:bookmarkStart w:id="55" w:name="culture-health-and-what-isnt-a-problem"/>
     <w:p>
       <w:pPr>
         <w:pStyle w:val="Heading1"/>
@@ -1533,8 +1982,8 @@
         <w:t xml:space="preserve">Some students have genuine reasons for not eating breakfast that have nothing to do with any of the above: intermittent fasting as a deliberate choice, a belief that they’re already healthy enough not to need it, family or regional habits that never included a formal breakfast at all, dietary or religious practice, or simple discomfort eating certain foods, like egg, somewhere visible and shared. None of that is dysfunction, and a meaningful share of what looks like low turnout is really just how a genuinely diverse group of people eats. That doesn’t undercut the billing and governance findings elsewhere in this document, but it does mean no future fix should be judged by whether it gets turnout close to one hundred percent.</w:t>
       </w:r>
     </w:p>
-    <w:bookmarkEnd w:id="34"/>
-    <w:bookmarkStart w:id="35" w:name="what-stands-out-most"/>
+    <w:bookmarkEnd w:id="55"/>
+    <w:bookmarkStart w:id="56" w:name="what-stands-out-most"/>
     <w:p>
       <w:pPr>
         <w:pStyle w:val="Heading1"/>
@@ -1551,8 +2000,8 @@
         <w:t xml:space="preserve">The institution has already built and run a working fix for the core problem. It just isn’t the standing default, and the reason looks like a real trade off around vendor certainty, not a simple oversight. Kadamba, Yuktahar, and Bakul and Palash are three different kitchen systems, not one, so findings from one shouldn’t be assumed to apply everywhere. Decoupled billing may suit the vendor’s revenue as much as it reflects institutional inattention. Composting and the resale market do the exact same job in different places: they absorb a cost quietly enough that nobody’s ever forced to fix what’s actually causing it. Skip Meal works when used, the real problem is that almost nobody uses it. The class schedule almost certainly has its own good reasons and shouldn’t be treated as something to just change. At least two demand streams, faculty and early shift staff, are probably invisible in every number this system tracks. And a real share of what looks like a paradox is simply legitimate variation in how people eat, not something to solve away.</w:t>
       </w:r>
     </w:p>
-    <w:bookmarkEnd w:id="35"/>
-    <w:bookmarkStart w:id="36" w:name="whats-still-missing"/>
+    <w:bookmarkEnd w:id="56"/>
+    <w:bookmarkStart w:id="57" w:name="whats-still-missing"/>
     <w:p>
       <w:pPr>
         <w:pStyle w:val="Heading1"/>
@@ -1569,7 +2018,7 @@
         <w:t xml:space="preserve">The biggest open question is whether the vendor’s actual contract would allow any permanent version of the walk in model, even a partial one, without losing the lead time guarantee it depends on. Nobody has asked that question directly yet. Also unresolved: why Skip Meal usage is so low when the mechanism itself works, whether faculty or early shift staff have any real access to breakfast, whether the Canine Council mechanism described above is actually real at Kadamba, the exact meaning of Kadamba’s two different capacity numbers, whether the outside catering contract is fixed price or passed through as costs change, which of the two portal addresses is actually correct, and direct observation of an actual breakfast service window, which still hasn’t happened. A conversation with Giri, the CDS Chair, and with the mess committee directly, is also still pending.</w:t>
       </w:r>
     </w:p>
-    <w:bookmarkEnd w:id="36"/>
+    <w:bookmarkEnd w:id="57"/>
     <w:sectPr>
       <w:footnotePr>
         <w:numRestart w:val="eachSect"/>

</xml_diff>

<commit_message>
Add Task 8 reframe evidence register and standalone causal loop analysis
Build the Causal Loop / Feedback Analysis out as its own Task 7 deliverable
(07b), condensed from the L1-L10 loop rebuild with new diagrams. Add a
Task 8 evidence and validation register tracing assumptions from Phase 1
against real interview quotes and CFS Chair testimony. Rewrite the
Reframed Systemic Problem Statement to lead with the actual statement and
add supporting diagrams. Fix the System Map's stale loop captions and the
Systemic Problem Analysis poster citation for consistency with the new
loop findings. Build docx/pdf for every Task 8 deliverable, a full
five-deliverable submission bundle with cover page (Invictus_Phase2.pdf),
a condensed version of the same (Invictus_Phase2_Condensed.pdf), and a
Phase 2 consolidated report.
</commit_message>
<xml_diff>
--- a/deliverables/phase-2/System Map.docx
+++ b/deliverables/phase-2/System Map.docx
@@ -18,32 +18,6 @@
         <w:t xml:space="preserve">IIIT Hyderabad Breakfast Mess System</w:t>
       </w:r>
     </w:p>
-    <w:sdt>
-      <w:sdtPr>
-        <w:docPartObj>
-          <w:docPartGallery w:val="Table of Contents"/>
-          <w:docPartUnique/>
-        </w:docPartObj>
-      </w:sdtPr>
-      <w:sdtContent>
-        <w:p>
-          <w:pPr>
-            <w:pStyle w:val="TOCHeading"/>
-          </w:pPr>
-          <w:r>
-            <w:t xml:space="preserve">Table of Contents</w:t>
-          </w:r>
-        </w:p>
-        <w:p>
-          <w:r>
-            <w:fldChar w:fldCharType="begin" w:dirty="true"/>
-            <w:instrText xml:space="preserve">TOC \o "1-2" \h \z \u</w:instrText>
-            <w:fldChar w:fldCharType="separate"/>
-            <w:fldChar w:fldCharType="end"/>
-          </w:r>
-        </w:p>
-      </w:sdtContent>
-    </w:sdt>
     <w:bookmarkStart w:id="9" w:name="overview"/>
     <w:p>
       <w:pPr>
@@ -1579,7 +1553,7 @@
           <wp:inline>
             <wp:extent cx="5334000" cy="4406347"/>
             <wp:effectExtent b="0" l="0" r="0" t="0"/>
-            <wp:docPr descr="Skip Meal Loop" title="" id="37" name="Picture"/>
+            <wp:docPr descr="Skip Meal Mechanism, a real chain that does not close into a loop" title="" id="37" name="Picture"/>
             <a:graphic>
               <a:graphicData uri="http://schemas.openxmlformats.org/drawingml/2006/picture">
                 <pic:pic>
@@ -1622,7 +1596,7 @@
         <w:pStyle w:val="ImageCaption"/>
       </w:pPr>
       <w:r>
-        <w:t xml:space="preserve">Skip Meal Loop</w:t>
+        <w:t xml:space="preserve">Skip Meal Mechanism, a real chain that does not close into a loop</w:t>
       </w:r>
     </w:p>
     <w:p>
@@ -1642,7 +1616,7 @@
           <wp:inline>
             <wp:extent cx="5334000" cy="4638260"/>
             <wp:effectExtent b="0" l="0" r="0" t="0"/>
-            <wp:docPr descr="Capacity Redistribution Loop" title="" id="40" name="Picture"/>
+            <wp:docPr descr="Capacity Redistribution, disconfirmed as a loop" title="" id="40" name="Picture"/>
             <a:graphic>
               <a:graphicData uri="http://schemas.openxmlformats.org/drawingml/2006/picture">
                 <pic:pic>
@@ -1685,7 +1659,7 @@
         <w:pStyle w:val="ImageCaption"/>
       </w:pPr>
       <w:r>
-        <w:t xml:space="preserve">Capacity Redistribution Loop</w:t>
+        <w:t xml:space="preserve">Capacity Redistribution, disconfirmed as a loop</w:t>
       </w:r>
     </w:p>
     <w:p>

</xml_diff>